<commit_message>
Ch21 Quiet Hands: new chapter (Patal Loka morning, Camilla's arm, Otto's tank, Flitzberg briefing, Elara finds Camilla, Baju's death, Rohan escalates); Ch20 review fixes (bracelet right wrist, filing line, Rohan corridor simplification); Ch18/19 analyst sweep; tracker Plan C
</commit_message>
<xml_diff>
--- a/manuscript/chapter-20-a-shield-in-every-doorway.docx
+++ b/manuscript/chapter-20-a-shield-in-every-doorway.docx
@@ -45,7 +45,82 @@
     </w:p>
     <w:p>
       <w:r>
-        <w:t>The charter took him an hour. The four evenings went on what came after: laying its promises over the city as it was now. Every public gathering place, every transit platform, every archive, every construction of consequence — he listed them, from the city's own public registers, and counted them, and set the count against Ashoka's roster of active commanders. The charter had been written for a city of a few hundred doorways. The city now had thousands. The arithmetic was the weapon, and arithmetic cannot be hurried.</w:t>
+        <w:t>The charter took him an hour. The four evenings went on what came after: laying its promises over the city as it was now. Every public gathering place, every transit platform, every archive, every construction of consequence — he listed them, from the city's own public registers, and counted them. The charter had been written for a city of a few hundred doorways. The city now had thousands. The arithmetic was the weapon, and arithmetic cannot be hurried.</w:t>
+      </w:r>
+    </w:p>
+    <w:p>
+      <w:r>
+        <w:t>One number the public registers could not give him. The count of Ashoka's active commanders — who they were, where they stood, how many hands the house actually had — lived inside Ashoka, on Ashoka's own rolls, behind Ashoka's own walls. No monitor's console in Drona had any business showing it.</w:t>
+      </w:r>
+    </w:p>
+    <w:p>
+      <w:r>
+        <w:t>On the fourth evening he laid his right wrist on the desk beside the console, and the obsidian bracelet did what it did.</w:t>
+      </w:r>
+    </w:p>
+    <w:p>
+      <w:r>
+        <w:t>He had worn it long enough to stop being startled by it and not long enough to stop noticing.</w:t>
+      </w:r>
+    </w:p>
+    <w:p>
+      <w:r>
+        <w:t>It began, as it always began, under the skin. The band was lined on its inner face with a lattice finer than hair, and the lattice listened — not to his thoughts, nothing so crude, but to the nerves of his forearm, where every movement of the hand is rehearsed a fraction of a second before the muscle obeys. The bracelet could not choose a door for him. It did not know what a roster was, or that he wanted one. What it knew was his hand, and it knew it a heartbeat early.</w:t>
+      </w:r>
+    </w:p>
+    <w:p>
+      <w:r>
+        <w:t>So he did the choosing. He keyed the request for Ashoka's duty rolls himself.</w:t>
+      </w:r>
+    </w:p>
+    <w:p>
+      <w:r>
+        <w:t>On any ordinary night, that request would have gone nowhere. Every house's instruments ran on the same lines beneath the city, but each house kept its own doors on those lines. A Drona monitor's console had no door that opened onto Ashoka. The request should have died in the glass in front of him.</w:t>
+      </w:r>
+    </w:p>
+    <w:p>
+      <w:r>
+        <w:t>Instead the bracelet took it.</w:t>
+      </w:r>
+    </w:p>
+    <w:p>
+      <w:r>
+        <w:t>He felt it leave. That was the only word he had ever found for the sensation — the band reading the finished gesture off his forearm, and then carrying the request out of the room along lines the console could not use. Down through the tower. Across the dark between platforms. Up to Ashoka's record walls, where it arrived looking like a knock from inside.</w:t>
+      </w:r>
+    </w:p>
+    <w:p>
+      <w:r>
+        <w:t>He watched it happen on his own screen. The cursor moved through three fields he had not touched — fields a Drona console did not even have keys for — and filled them with routing marks in Ashoka's own form. A form no one outside Ashoka was ever taught. Certainly not a Kubera treasury officer who had learned his trade in seals and balances. His hand lay still on the desk the whole time, and the band grew warm against the bone of his wrist.</w:t>
+      </w:r>
+    </w:p>
+    <w:p>
+      <w:r>
+        <w:t>Then Ashoka's walls did what every wall in the city does. They asked who was knocking.</w:t>
+      </w:r>
+    </w:p>
+    <w:p>
+      <w:r>
+        <w:t>Every instrument in the city asked that question of anyone who touched it — who are you, and what are you permitted — and every house's instruments asked it in their own dialect: Drona's in sequences of verification, Kubera's in seals and balances, Ashoka's in rank and standing order. A request arriving from Drona's lines should have been turned away at the first word. This was the bracelet's second work, and the one that still unsettled him most. It did not argue with the wall. It never argued. When the question came, it answered in Ashoka's dialect, in the credentials of an officer with every right to be asking — rank, posting, standing order, all of them in Ashoka's own forms — and did it so fluently that the wall had no reason to doubt the voice was real.</w:t>
+      </w:r>
+    </w:p>
+    <w:p>
+      <w:r>
+        <w:t>The heat in the band sharpened to a thin line and faded. The house seal in the corner of his screen flickered from Drona's to Ashoka's and back so quickly that an onlooker would have thought the light had caught it wrong. And Ashoka's duty rolls opened on an ordinary Drona monitor's console as though they had always been filed there. Every commander. Every posting. Every hall. Somewhere behind Ashoka's walls, a record system had just handed a stranger its house's whole roster and written down, in its own log, that it had handed the roster to one of its own.</w:t>
+      </w:r>
+    </w:p>
+    <w:p>
+      <w:r>
+        <w:t>That was the part that still cooled his skin, four evenings in, with the door locked and no one watching. Not that the bracelet reached. He had known it could reach since the night it first woke a hand that was not his. It was how little of the reaching he could feel anymore. His fingers chose the door; that much was still his. But between his choosing and the door's opening, the band did so much, so fast, and so far below the level at which he could watch it, that some nights he was no longer sure where his hand ended and the instrument began — whether he was using it, or whether it had simply learned the way he moved and was moving with him, a heartbeat ahead, toward doors he had not yet admitted he would open.</w:t>
+      </w:r>
+    </w:p>
+    <w:p>
+      <w:r>
+        <w:t>He read the rolls, took his count, closed them, and the console was an ordinary monitor's console again, with no memory of having been anything else. He flexed his right hand once, slowly, to be sure it was still his.</w:t>
+      </w:r>
+    </w:p>
+    <w:p>
+      <w:r>
+        <w:t>Then he set Ashoka's hands against the city's doorways, and the arithmetic said what he had designed it to say.</w:t>
       </w:r>
     </w:p>
     <w:p>
@@ -60,7 +135,7 @@
     </w:p>
     <w:p>
       <w:r>
-        <w:t>The instrument was called a mandate review, and it traveled the most respectable road in the city. Kubera's council would sponsor it — generously, publicly, admiringly. The language had taken Daren a full evening, because the language was the weapon's edge: *The city has grown beyond the reach of its guardians, through no fault of theirs. Kubera proposes to fund what Ashoka has always promised — a guardian presence at every public gathering, every transit platform, every archive, every construction of consequence, every doorway the charter named. The guardians have never failed the city. The city has failed to pay for its guardians. Kubera asks leave to correct its own house's oversight.*</w:t>
+        <w:t>The instrument was called a mandate review, and it traveled the most respectable road in the city. Kubera's council would sponsor it — generously, publicly, admiringly. The language had taken Daren a full evening, because the language was the weapon's edge: "The city has grown beyond the reach of its guardians, through no fault of theirs. Kubera proposes to fund what Ashoka has always promised — a guardian presence at every public gathering, every transit platform, every archive, every construction of consequence, every doorway the charter named. The guardians have never failed the city. The city has failed to pay for its guardians. Kubera asks Ashoka's permission to correct that failure."</w:t>
       </w:r>
     </w:p>
     <w:p>
@@ -70,12 +145,17 @@
     </w:p>
     <w:p>
       <w:r>
-        <w:t>And Ashoka could not refuse. That was the lock at the heart of it. A house built on duty cannot decline duty that arrives funded and praised — refusal would mean standing before the city and saying the charter's words no longer bind us, and Ashoka would dissolve itself before it said that. They would accept. Their own oath would walk them into the flood, the way water walks into a pipe.</w:t>
+        <w:t>And Ashoka could not refuse. That was the lock at the heart of it. A house built on duty cannot decline duty that arrives funded and praised — refusal would mean standing before the city and saying the charter's words no longer bind us, and Ashoka would dissolve itself before it said that. They would accept. Their own oath would walk them into the flood, and they would call it duty the whole way down.</w:t>
       </w:r>
     </w:p>
     <w:p>
       <w:r>
-        <w:t>And the arithmetic from those four evenings said what he had designed it to say. Ashoka was the smallest of the four houses — discipline over numbers had always been its pride. Set its commanders against the duties the review would wake, and every senior officer in that house inherited postings, escorts, ceremonies, inspection stands. Not one of them crushing. All of them together, a tide. A blade asked to be a shield in every doorway at once is still a blade — but it is a blade that has no hand free to swing.</w:t>
+        <w:t>And the arithmetic was unforgiving. Ashoka was the smallest of the four houses — discipline over numbers had always been its pride. Set its commanders against the duties the review would wake, and every senior officer in that house inherited postings, escorts, ceremonies, inspection stands. No single one of those duties would break anyone. Together, they would fill every hour the house had.</w:t>
+      </w:r>
+    </w:p>
+    <w:p>
+      <w:r>
+        <w:t>That was the whole design. Ashoka was a blade — the one house in the city built to strike when something went wrong. Ask that blade to stand guard in a thousand doorways at once, and it is still a blade. It simply has no hand left free to swing.</w:t>
       </w:r>
     </w:p>
     <w:p>
@@ -90,7 +170,7 @@
     </w:p>
     <w:p>
       <w:r>
-        <w:t>The message arrived on the panel in Ravi's quarters a little after the night bell, while he was sitting on the edge of his bed with his shoes still on.</w:t>
+        <w:t>The message arrived on the panel in Ravi's quarters a little after the night bell, while he was sitting on the edge of his bed with his shoes still on — the way he had sat most nights since the memorandum, never quite finishing the business of coming home, as though some part of him expected to be sent for.</w:t>
       </w:r>
     </w:p>
     <w:p>
@@ -134,7 +214,7 @@
     </w:p>
     <w:p>
       <w:r>
-        <w:t>Room Four was one of six small review rooms along the policy corridor, and it was booked under his name, which he had not booked. The schedule outside the door said what schedules in Chanakya always said: Analyst Ravi, policy review, two hours. A colleague passing with a stack of binders nodded to him. A clerk at the end of the corridor glanced at the board, glanced at him, and went back to her stamping. To every eye in the house, this was the most ordinary afternoon a third-grade analyst could have.</w:t>
+        <w:t>Room Four was one of six small review rooms along the policy corridor, and it was booked under his name, which he had not booked. The schedule outside the door said what schedules in Chanakya always said: Analyst Ravi, policy review, two hours. A colleague passing with a stack of binders nodded to him. A clerk at the end of the corridor glanced at the board, glanced at him, and went back to her stamping. To every eye in the house, this was the most ordinary afternoon an analyst could have.</w:t>
       </w:r>
     </w:p>
     <w:p>
@@ -144,7 +224,7 @@
     </w:p>
     <w:p>
       <w:r>
-        <w:t>Nothing dramatic happened. That was the most frightening part. The seal stayed in its corner. The screen did not darken or flicker. It simply became a different screen while keeping the same face, the way a man can keep his expression while changing his mind. The docket list was gone. In its place was a single document and a narrow column beside it for notes, and a line of small text at the top:</w:t>
+        <w:t>Nothing dramatic happened. That was the most frightening part. The seal stayed in its corner. The screen did not darken or flicker. It simply became a different screen while keeping the same face, the way a man can keep his expression while changing his mind. The docket list was gone. In its place was a single document and a narrow column beside it for notes, and a single word of small text at the top:</w:t>
       </w:r>
     </w:p>
     <w:p>
@@ -153,12 +233,12 @@
           <w:i/>
           <w:color w:val="5C6B7D"/>
         </w:rPr>
-        <w:t>This session is not recorded by your house. Your house records a review. Work.</w:t>
+        <w:t>Work.</w:t>
       </w:r>
     </w:p>
     <w:p>
       <w:r>
-        <w:t>He understood, without needing it explained, what he was sitting in. Somewhere in Chanakya's logs, a policy review was in progress in Room Four, quietly accumulating the ordinary marks of a man doing his job. And he was not doing his job. He was sitting inside a room that belonged to someone else, borrowed for two hours and wearing his house's walls.</w:t>
+        <w:t>No one explained the arrangement to him. No one needed to. He knew what consoles remember, and he could read this one's situation the way he read any record: somewhere in Chanakya's logs, a policy review was in progress in Room Four, quietly accumulating the ordinary marks of a man doing his job. And he was not doing his job. He was sitting inside a room that belonged to someone else, borrowed for two hours and wearing his house's walls.</w:t>
       </w:r>
     </w:p>
     <w:p>
@@ -168,7 +248,7 @@
     </w:p>
     <w:p>
       <w:r>
-        <w:t>It was a mandate review, sponsored by Kubera's allocation council, concerning Ashoka. He knew what it was before he finished the first page, because he had spent eleven years learning to read a document's purpose from its first page. It woke the old promises in Ashoka's founding charter — a guardian presence at every gathering, every platform, every archive, every construction of consequence — and offered Kubera's money to pay for all of them. The language was warm. The language was generous. The language was, he noticed with a professional's unwilling admiration, almost impossible to argue with.</w:t>
+        <w:t>It was a mandate review, sponsored by Kubera's allocation council, concerning Ashoka. He knew what it was for before he finished the first page; a document's purpose is always in its first page, for anyone trained to look. It woke the old promises in Ashoka's founding charter — a guardian presence at every gathering, every platform, every archive, every construction of consequence — and offered Kubera's money to pay for all of them. The language was warm. The language was generous. The language was, he noticed with a professional's unwilling admiration, almost impossible to argue with.</w:t>
       </w:r>
     </w:p>
     <w:p>
@@ -282,7 +362,12 @@
     </w:p>
     <w:p>
       <w:r>
-        <w:t>He felt the shape of that settle in him like a weight he would carry home. He also felt, and hated himself a little for it, the clean satisfaction of a job done well. Eleven years he had wanted his work to matter at the highest level the city had. It mattered now. He had just made the most airtight document of his career, and no one would ever know his hand had touched it, and it was aimed at the one house in the city that still believed in standing in the way.</w:t>
+        <w:t>He felt that knowledge settle in him like a weight he would carry home.</w:t>
+      </w:r>
+    </w:p>
+    <w:p>
+      <w:r>
+        <w:t>He felt something else too, and hated himself a little for it: the clean satisfaction of a job done well. All his working life he had wanted his work to matter at the highest level the city had. Now it did. He had just written the most airtight document of his career. No one would ever know his hand had touched it. And it was aimed at the one house in the city that still believed in standing in the way.</w:t>
       </w:r>
     </w:p>
     <w:p>
@@ -321,7 +406,7 @@
     </w:p>
     <w:p>
       <w:r>
-        <w:t>On the walk back to his desk he put his hand flat against his breast pocket, over the slip of paper, the way a man touches a wound to check that it is still there.</w:t>
+        <w:t>On the walk back to his desk he put his hand flat against his breast pocket, over the folded slip with the old file number on it — the one case the records had ever refused to explain to him — the way a man touches a wound to check that it is still there.</w:t>
       </w:r>
     </w:p>
     <w:p>
@@ -331,12 +416,22 @@
     </w:p>
     <w:p>
       <w:r>
-        <w:t>That evening, from the unlabeled room in the Drona monitor tower, Daren read the finished instrument through once. It was better than he had hoped. Every door he could think of had been bricked shut by someone who knew the doors from the inside, and the language around the bricks still read as warm as before. He noted one thing the analyst had chosen not to fix — the house's freedom to arrange its own officers — and decided it was correct. A gift that dictated postings would look like a command. Let the Grandmaster shuffle her pieces. The board was his.</w:t>
+        <w:t>That evening, from the unlabeled room in the Drona monitor tower, Daren read the finished instrument through once. It was better than he had hoped. Every door he could think of had been bricked shut by someone who knew the doors from the inside, and the language around the bricks still read as warm as before.</w:t>
       </w:r>
     </w:p>
     <w:p>
       <w:r>
-        <w:t>He filed the sponsorship through the Grandmaster's council bloc and sat back in the quiet of the tower.</w:t>
+        <w:t>He read it as he read everything — in totals. So many duties woken; so many commanders to carry them; the first number larger than the second by a comfortable margin. That was the weapon, and the weapon was sound. Who in Ashoka would stand at which doorway was a question for Ashoka's clerks, and it did not occur to him to ask it, because in his arithmetic it did not matter: every hand would be full regardless of whose it was. The analyst had left that distribution to the house. Daren did not notice that he had, any more than a man checking a ledger's balance notices the order of the entries.</w:t>
+      </w:r>
+    </w:p>
+    <w:p>
+      <w:r>
+        <w:t>The board was his. He did not think about the pieces.</w:t>
+      </w:r>
+    </w:p>
+    <w:p>
+      <w:r>
+        <w:t>He sent the sponsorship to the council members who answered to the Grandmaster, to be tabled and voted on as Kubera's own proposal. Then he sat back in the quiet of the tower.</w:t>
       </w:r>
     </w:p>
     <w:p>
@@ -376,17 +471,17 @@
     </w:p>
     <w:p>
       <w:r>
-        <w:t>By afternoon the pressure had acquired a voice. His superior in the commanders' line — a decent man, drowning like everyone else — stopped him in the corridor with a list in his hand. "The Drona review," the man said, not unkindly. "The procedural matter. It can wait, surely. Paper keeps. Platforms do not. I need you where the duties are."</w:t>
+        <w:t>By afternoon his superior stopped him in the corridor. He was a decent man, as overworked as everyone else, and he had a list in his hand. "The Drona review," he said, not unkindly. "The procedural matter. It can wait. Paper keeps. Platforms do not. I need you where the duties are."</w:t>
       </w:r>
     </w:p>
     <w:p>
       <w:r>
-        <w:t>Paper keeps, Rohan thought. Open, in this city, is a kind of sleep. He had heard the shape of that argument before, from the other side of a wall of panels.</w:t>
+        <w:t>Paper keeps, Rohan thought. That was the same argument that had put three cases on the dead-room wall and left them there, open and unread, for years. Paper kept. It just never got looked at again.</w:t>
       </w:r>
     </w:p>
     <w:p>
       <w:r>
-        <w:t>He gave the proper answers, accepted the proper share, and walked the long way back along the training halls — and somewhere between one doorway and the next, the soldier's part of his mind went still, and the hunter's part finished the count.</w:t>
+        <w:t>He said yes, took his share of the postings, and walked the long way back along the training halls. Somewhere between one doorway and the next he stopped thinking like a soldier and started thinking like a hunter. He counted the gifts.</w:t>
       </w:r>
     </w:p>
     <w:p>

</xml_diff>